<commit_message>
Author contributions updated (Hanh, Binh, Trung)
Co-Authored-By: Claude Sonnet 5.5 <noreply@anthropic.com>
Claude-Session: https://claude.ai/code/session_019rg5o9hDTDUTznqt5xBjmb
</commit_message>
<xml_diff>
--- a/paper2/final/SciRep/Manuscript_SciRep.docx
+++ b/paper2/final/SciRep/Manuscript_SciRep.docx
@@ -658,7 +658,7 @@
         <w:t xml:space="preserve"> </w:t>
       </w:r>
       <w:r>
-        <w:t xml:space="preserve">= 0.13). After floor closes, days</w:t>
+        <w:t xml:space="preserve">= 0.126). After floor closes, days</w:t>
       </w:r>
       <w:r>
         <w:t xml:space="preserve"> </w:t>
@@ -927,7 +927,7 @@
         <w:t xml:space="preserve"> </w:t>
       </w:r>
       <w:r>
-        <w:t xml:space="preserve">= 0.16).</w:t>
+        <w:t xml:space="preserve">= 0.162).</w:t>
       </w:r>
     </w:p>
     <w:p>
@@ -989,7 +989,7 @@
         <w:t xml:space="preserve"> </w:t>
       </w:r>
       <w:r>
-        <w:t xml:space="preserve">= 0.32).</w:t>
+        <w:t xml:space="preserve">= 0.317).</w:t>
       </w:r>
     </w:p>
     <w:p>
@@ -1057,7 +1057,7 @@
         <w:t xml:space="preserve"> </w:t>
       </w:r>
       <w:r>
-        <w:t xml:space="preserve">= 0.07), which supports H</w:t>
+        <w:t xml:space="preserve">= 0.072), which supports H</w:t>
       </w:r>
       <w:r>
         <w:rPr>
@@ -1095,7 +1095,7 @@
         <w:t xml:space="preserve"> </w:t>
       </w:r>
       <w:r>
-        <w:t xml:space="preserve">= 0.09), which is not significant at the 5% level.</w:t>
+        <w:t xml:space="preserve">= 0.089), which is not significant at the 5% level.</w:t>
       </w:r>
     </w:p>
     <w:p>
@@ -1421,7 +1421,7 @@
         <w:t xml:space="preserve"> </w:t>
       </w:r>
       <w:r>
-        <w:t xml:space="preserve">= 0.11). The floor gap is more negative after the move, at −0.42% before and −1.37% after (difference</w:t>
+        <w:t xml:space="preserve">= 0.110). The floor gap is more negative after the move, at −0.42% before and −1.37% after (difference</w:t>
       </w:r>
       <w:r>
         <w:t xml:space="preserve"> </w:t>
@@ -1495,7 +1495,7 @@
         <w:t xml:space="preserve"> </w:t>
       </w:r>
       <w:r>
-        <w:t xml:space="preserve">= 0.32) nor the floor gap (</w:t>
+        <w:t xml:space="preserve">= 0.317) nor the floor gap (</w:t>
       </w:r>
       <w:r>
         <w:rPr>
@@ -1524,7 +1524,7 @@
         <w:t xml:space="preserve"> </w:t>
       </w:r>
       <w:r>
-        <w:t xml:space="preserve">= 0.06) is significant at the 5% level, so the full-sample significance of these two measures rests mainly on post-change events. We cannot attribute the differences between the periods to the auction rules.</w:t>
+        <w:t xml:space="preserve">= 0.057) is significant at the 5% level, so the full-sample significance of these two measures rests mainly on post-change events. We cannot attribute the differences between the periods to the auction rules.</w:t>
       </w:r>
     </w:p>
     <w:p>
@@ -1615,7 +1615,7 @@
         <w:t xml:space="preserve"> </w:t>
       </w:r>
       <w:r>
-        <w:t xml:space="preserve">= 0.11). For floors, the difference is positive at the four placebo dates before the platform change and negative at 11 of the 11 later ones; the split at 5 May 2025 gives −0.95 points (</w:t>
+        <w:t xml:space="preserve">= 0.110). For floors, the difference is positive at the four placebo dates before the platform change and negative at 11 of the 11 later ones; the split at 5 May 2025 gives −0.95 points (</w:t>
       </w:r>
       <w:r>
         <w:rPr>
@@ -1676,7 +1676,7 @@
         <w:t xml:space="preserve"> </w:t>
       </w:r>
       <w:r>
-        <w:t xml:space="preserve">= 0.13), the quarter with the most floor events (802). The placebo dates therefore cannot separate a break at the platform change from a shift specific to that quarter.</w:t>
+        <w:t xml:space="preserve">= 0.134), the quarter with the most floor events (802). The placebo dates therefore cannot separate a break at the platform change from a shift specific to that quarter.</w:t>
       </w:r>
     </w:p>
     <w:p>
@@ -1744,7 +1744,7 @@
         <w:t xml:space="preserve"> </w:t>
       </w:r>
       <w:r>
-        <w:t xml:space="preserve">= 0.42). For floors, the excess gap was −1.62 points before (</w:t>
+        <w:t xml:space="preserve">= 0.424). For floors, the excess gap was −1.62 points before (</w:t>
       </w:r>
       <w:r>
         <w:rPr>
@@ -1802,7 +1802,7 @@
         <w:t xml:space="preserve"> </w:t>
       </w:r>
       <w:r>
-        <w:t xml:space="preserve">= 0.13). The break at the limit is therefore present before the change and does not depend on the post-change period, although the significance of the raw ceiling close-to-close return and of the raw floor gap does (Table 4). These comparisons describe timing, not an effect of the auction rules.</w:t>
+        <w:t xml:space="preserve">= 0.134). The break at the limit is therefore present before the change and does not depend on the post-change period, although the significance of the raw ceiling close-to-close return and of the raw floor gap does (Table 4). These comparisons describe timing, not an effect of the auction rules.</w:t>
       </w:r>
     </w:p>
     <w:p>
@@ -8031,7 +8031,7 @@
         <w:jc w:val="left"/>
       </w:pPr>
       <w:r>
-        <w:t xml:space="preserve">H.H.H. contributed to the methodology and validation and reviewed and edited the manuscript. N.V.T. conceived the study, curated the data, performed the formal analysis, developed the methodology and software, produced the visualizations, administered the project and wrote the original draft. N.T.B. conceived the study, supervised the work, validated the results, and reviewed and edited the manuscript.</w:t>
+        <w:t xml:space="preserve">H.H.H. contributed to the conceptualization and reviewed and edited the manuscript, including its language. N.V.T. curated the data, performed the formal analysis, developed the methodology and software, produced the visualizations, administered the project and wrote the original draft. N.T.B. conceived the study, supervised the work, and reviewed and edited the manuscript.</w:t>
       </w:r>
     </w:p>
     <w:p>

</xml_diff>